<commit_message>
add pdf version of the laboratory report
</commit_message>
<xml_diff>
--- a/lab1/Steganography_Lab1_Бондар В.В..docx
+++ b/lab1/Steganography_Lab1_Бондар В.В..docx
@@ -2871,40 +2871,7 @@
           <w:szCs w:val="28"/>
           <w:lang w:val="en-US"/>
         </w:rPr>
-        <w:t xml:space="preserve">                                           </w:t>
-      </w:r>
-      <w:r>
-        <w:rPr>
-          <w:b/>
-          <w:i/>
-          <w:iCs/>
-          <w:sz w:val="28"/>
-          <w:szCs w:val="28"/>
-          <w:lang w:val="en-US"/>
-        </w:rPr>
-        <w:t xml:space="preserve"> </w:t>
-      </w:r>
-      <w:r>
-        <w:rPr>
-          <w:b/>
-          <w:i/>
-          <w:iCs/>
-          <w:sz w:val="28"/>
-          <w:szCs w:val="28"/>
-          <w:lang w:val="en-US"/>
-        </w:rPr>
-        <w:t xml:space="preserve"> </w:t>
-      </w:r>
-      <w:r>
-        <w:rPr>
-          <w:b/>
-          <w:i/>
-          <w:iCs/>
-          <w:sz w:val="28"/>
-          <w:szCs w:val="28"/>
-          <w:lang w:val="en-US"/>
-        </w:rPr>
-        <w:t xml:space="preserve"> </w:t>
+        <w:t xml:space="preserve">                                              </w:t>
       </w:r>
       <w:proofErr w:type="spellStart"/>
       <w:r>
@@ -2976,34 +2943,7 @@
           <w:szCs w:val="28"/>
           <w:lang w:val="en-US"/>
         </w:rPr>
-        <w:t xml:space="preserve">                                     v</w:t>
-      </w:r>
-      <w:r>
-        <w:rPr>
-          <w:bCs/>
-          <w:sz w:val="28"/>
-          <w:szCs w:val="28"/>
-          <w:lang w:val="en-US"/>
-        </w:rPr>
-        <w:t xml:space="preserve"> = </w:t>
-      </w:r>
-      <w:r>
-        <w:rPr>
-          <w:bCs/>
-          <w:sz w:val="28"/>
-          <w:szCs w:val="28"/>
-          <w:lang w:val="en-US"/>
-        </w:rPr>
-        <w:t>118</w:t>
-      </w:r>
-      <w:r>
-        <w:rPr>
-          <w:bCs/>
-          <w:sz w:val="28"/>
-          <w:szCs w:val="28"/>
-          <w:lang w:val="en-US"/>
-        </w:rPr>
-        <w:t xml:space="preserve"> → </w:t>
+        <w:t xml:space="preserve">                                     v = 118 → </w:t>
       </w:r>
       <w:r>
         <w:rPr>
@@ -3393,6 +3333,7 @@
       <w:r>
         <w:rPr>
           <w:bCs/>
+          <w:noProof/>
           <w:sz w:val="28"/>
           <w:szCs w:val="28"/>
           <w:lang w:val="uk-UA"/>
@@ -3451,6 +3392,7 @@
       <w:r>
         <w:rPr>
           <w:bCs/>
+          <w:noProof/>
           <w:sz w:val="28"/>
           <w:szCs w:val="28"/>
           <w:lang w:val="en-US"/>
@@ -3845,18 +3787,7 @@
           <w:szCs w:val="28"/>
           <w:lang w:val="en-US"/>
         </w:rPr>
-        <w:t>4</w:t>
-      </w:r>
-      <w:r>
-        <w:rPr>
-          <w:b/>
-          <w:i/>
-          <w:iCs/>
-          <w:sz w:val="28"/>
-          <w:szCs w:val="28"/>
-          <w:lang w:val="en-US"/>
-        </w:rPr>
-        <w:t>1</w:t>
+        <w:t>41</w:t>
       </w:r>
       <w:r>
         <w:rPr>
@@ -3977,6 +3908,7 @@
       <w:r>
         <w:rPr>
           <w:bCs/>
+          <w:noProof/>
           <w:sz w:val="28"/>
           <w:szCs w:val="28"/>
           <w:lang w:val="uk-UA"/>
@@ -4042,6 +3974,7 @@
       <w:r>
         <w:rPr>
           <w:bCs/>
+          <w:noProof/>
           <w:sz w:val="28"/>
           <w:szCs w:val="28"/>
           <w:lang w:val="en-US"/>
@@ -4134,9 +4067,8 @@
           <w:sz w:val="28"/>
           <w:szCs w:val="28"/>
         </w:rPr>
-        <w:t xml:space="preserve"> </w:t>
-      </w:r>
-      <w:proofErr w:type="spellStart"/>
+        <w:t xml:space="preserve"> пікселя (</w:t>
+      </w:r>
       <w:r>
         <w:rPr>
           <w:b/>
@@ -4144,10 +4076,10 @@
           <w:iCs/>
           <w:sz w:val="28"/>
           <w:szCs w:val="28"/>
-        </w:rPr>
-        <w:t>пікселя</w:t>
-      </w:r>
-      <w:proofErr w:type="spellEnd"/>
+          <w:lang w:val="en-US"/>
+        </w:rPr>
+        <w:t>2</w:t>
+      </w:r>
       <w:r>
         <w:rPr>
           <w:b/>
@@ -4156,7 +4088,7 @@
           <w:sz w:val="28"/>
           <w:szCs w:val="28"/>
         </w:rPr>
-        <w:t xml:space="preserve"> (</w:t>
+        <w:t>, 0)</w:t>
       </w:r>
       <w:r>
         <w:rPr>
@@ -4167,8 +4099,9 @@
           <w:szCs w:val="28"/>
           <w:lang w:val="en-US"/>
         </w:rPr>
-        <w:t>2</w:t>
-      </w:r>
+        <w:t xml:space="preserve">                     </w:t>
+      </w:r>
+      <w:proofErr w:type="spellStart"/>
       <w:r>
         <w:rPr>
           <w:b/>
@@ -4177,8 +4110,9 @@
           <w:sz w:val="28"/>
           <w:szCs w:val="28"/>
         </w:rPr>
-        <w:t>, 0)</w:t>
-      </w:r>
+        <w:t>Модифікація</w:t>
+      </w:r>
+      <w:proofErr w:type="spellEnd"/>
       <w:r>
         <w:rPr>
           <w:b/>
@@ -4186,9 +4120,8 @@
           <w:iCs/>
           <w:sz w:val="28"/>
           <w:szCs w:val="28"/>
-          <w:lang w:val="en-US"/>
-        </w:rPr>
-        <w:t xml:space="preserve">                     </w:t>
+        </w:rPr>
+        <w:t xml:space="preserve"> </w:t>
       </w:r>
       <w:proofErr w:type="spellStart"/>
       <w:r>
@@ -4199,7 +4132,7 @@
           <w:sz w:val="28"/>
           <w:szCs w:val="28"/>
         </w:rPr>
-        <w:t>Модифікація</w:t>
+        <w:t>пікселя</w:t>
       </w:r>
       <w:proofErr w:type="spellEnd"/>
       <w:r>
@@ -4210,9 +4143,8 @@
           <w:sz w:val="28"/>
           <w:szCs w:val="28"/>
         </w:rPr>
-        <w:t xml:space="preserve"> </w:t>
-      </w:r>
-      <w:proofErr w:type="spellStart"/>
+        <w:t xml:space="preserve"> (</w:t>
+      </w:r>
       <w:r>
         <w:rPr>
           <w:b/>
@@ -4220,41 +4152,9 @@
           <w:iCs/>
           <w:sz w:val="28"/>
           <w:szCs w:val="28"/>
-        </w:rPr>
-        <w:t>пікселя</w:t>
-      </w:r>
-      <w:proofErr w:type="spellEnd"/>
-      <w:r>
-        <w:rPr>
-          <w:b/>
-          <w:i/>
-          <w:iCs/>
-          <w:sz w:val="28"/>
-          <w:szCs w:val="28"/>
-        </w:rPr>
-        <w:t xml:space="preserve"> (</w:t>
-      </w:r>
-      <w:r>
-        <w:rPr>
-          <w:b/>
-          <w:i/>
-          <w:iCs/>
-          <w:sz w:val="28"/>
-          <w:szCs w:val="28"/>
           <w:lang w:val="en-US"/>
         </w:rPr>
-        <w:t>4</w:t>
-      </w:r>
-      <w:r>
-        <w:rPr>
-          <w:b/>
-          <w:i/>
-          <w:iCs/>
-          <w:sz w:val="28"/>
-          <w:szCs w:val="28"/>
-          <w:lang w:val="en-US"/>
-        </w:rPr>
-        <w:t>2</w:t>
+        <w:t>42</w:t>
       </w:r>
       <w:r>
         <w:rPr>
@@ -4280,6 +4180,7 @@
       <w:r>
         <w:rPr>
           <w:bCs/>
+          <w:noProof/>
           <w:sz w:val="28"/>
           <w:szCs w:val="28"/>
           <w:lang w:val="uk-UA"/>
@@ -4338,6 +4239,7 @@
       <w:r>
         <w:rPr>
           <w:bCs/>
+          <w:noProof/>
           <w:sz w:val="28"/>
           <w:szCs w:val="28"/>
           <w:lang w:val="en-US"/>
@@ -6527,6 +6429,7 @@
       </w:pPr>
       <w:r>
         <w:rPr>
+          <w:noProof/>
           <w:sz w:val="28"/>
           <w:szCs w:val="28"/>
           <w:lang w:val="uk-UA"/>
@@ -6586,25 +6489,7 @@
           <w:szCs w:val="28"/>
           <w:lang w:val="uk-UA"/>
         </w:rPr>
-        <w:t xml:space="preserve">Рис. </w:t>
-      </w:r>
-      <w:r>
-        <w:rPr>
-          <w:bCs/>
-          <w:sz w:val="28"/>
-          <w:szCs w:val="28"/>
-          <w:lang w:val="uk-UA"/>
-        </w:rPr>
-        <w:t>2</w:t>
-      </w:r>
-      <w:r>
-        <w:rPr>
-          <w:bCs/>
-          <w:sz w:val="28"/>
-          <w:szCs w:val="28"/>
-          <w:lang w:val="uk-UA"/>
-        </w:rPr>
-        <w:t xml:space="preserve">. - </w:t>
+        <w:t xml:space="preserve">Рис. 2. - </w:t>
       </w:r>
       <w:proofErr w:type="spellStart"/>
       <w:r>
@@ -7450,6 +7335,7 @@
       <w:r>
         <w:rPr>
           <w:bCs/>
+          <w:noProof/>
           <w:sz w:val="28"/>
           <w:szCs w:val="28"/>
           <w:lang w:val="en-US"/>
@@ -7518,25 +7404,7 @@
           <w:szCs w:val="28"/>
           <w:lang w:val="uk-UA"/>
         </w:rPr>
-        <w:t xml:space="preserve">Рис. </w:t>
-      </w:r>
-      <w:r>
-        <w:rPr>
-          <w:bCs/>
-          <w:sz w:val="28"/>
-          <w:szCs w:val="28"/>
-          <w:lang w:val="uk-UA"/>
-        </w:rPr>
-        <w:t>3</w:t>
-      </w:r>
-      <w:r>
-        <w:rPr>
-          <w:bCs/>
-          <w:sz w:val="28"/>
-          <w:szCs w:val="28"/>
-          <w:lang w:val="uk-UA"/>
-        </w:rPr>
-        <w:t>. -</w:t>
+        <w:t>Рис. 3. -</w:t>
       </w:r>
       <w:r>
         <w:t xml:space="preserve"> </w:t>
@@ -7849,6 +7717,7 @@
       </w:pPr>
       <w:r>
         <w:rPr>
+          <w:noProof/>
           <w:sz w:val="28"/>
           <w:szCs w:val="28"/>
           <w:lang w:val="uk-UA"/>
@@ -7926,16 +7795,7 @@
           <w:szCs w:val="28"/>
           <w:lang w:val="uk-UA"/>
         </w:rPr>
-        <w:t xml:space="preserve">. </w:t>
-      </w:r>
-      <w:r>
-        <w:rPr>
-          <w:bCs/>
-          <w:sz w:val="28"/>
-          <w:szCs w:val="28"/>
-          <w:lang w:val="uk-UA"/>
-        </w:rPr>
-        <w:t>–</w:t>
+        <w:t>. –</w:t>
       </w:r>
       <w:r>
         <w:rPr>
@@ -8655,6 +8515,7 @@
       <w:r>
         <w:rPr>
           <w:bCs/>
+          <w:noProof/>
           <w:sz w:val="28"/>
           <w:szCs w:val="28"/>
           <w:lang w:val="en-US"/>
@@ -9389,6 +9250,7 @@
       <w:r>
         <w:rPr>
           <w:bCs/>
+          <w:noProof/>
           <w:sz w:val="28"/>
           <w:szCs w:val="28"/>
           <w:lang w:val="en-US"/>
@@ -13936,29 +13798,7 @@
           <w:szCs w:val="18"/>
           <w:lang w:val="uk-UA"/>
         </w:rPr>
-        <w:t xml:space="preserve"> = </w:t>
-      </w:r>
-      <w:proofErr w:type="spellStart"/>
-      <w:r>
-        <w:rPr>
-          <w:rFonts w:ascii="Consolas" w:hAnsi="Consolas"/>
-          <w:bCs/>
-          <w:sz w:val="18"/>
-          <w:szCs w:val="18"/>
-          <w:lang w:val="uk-UA"/>
-        </w:rPr>
-        <w:t>binary_data</w:t>
-      </w:r>
-      <w:proofErr w:type="spellEnd"/>
-      <w:r>
-        <w:rPr>
-          <w:rFonts w:ascii="Consolas" w:hAnsi="Consolas"/>
-          <w:bCs/>
-          <w:sz w:val="18"/>
-          <w:szCs w:val="18"/>
-          <w:lang w:val="uk-UA"/>
-        </w:rPr>
-        <w:t>[8:]</w:t>
+        <w:t xml:space="preserve"> = binary_data[8:]</w:t>
       </w:r>
     </w:p>
     <w:p>
@@ -15700,29 +15540,7 @@
           <w:szCs w:val="18"/>
           <w:lang w:val="uk-UA"/>
         </w:rPr>
-        <w:t xml:space="preserve"> </w:t>
-      </w:r>
-      <w:proofErr w:type="spellStart"/>
-      <w:r>
-        <w:rPr>
-          <w:rFonts w:ascii="Consolas" w:hAnsi="Consolas"/>
-          <w:bCs/>
-          <w:sz w:val="18"/>
-          <w:szCs w:val="18"/>
-          <w:lang w:val="uk-UA"/>
-        </w:rPr>
-        <w:t>choice</w:t>
-      </w:r>
-      <w:proofErr w:type="spellEnd"/>
-      <w:r>
-        <w:rPr>
-          <w:rFonts w:ascii="Consolas" w:hAnsi="Consolas"/>
-          <w:bCs/>
-          <w:sz w:val="18"/>
-          <w:szCs w:val="18"/>
-          <w:lang w:val="uk-UA"/>
-        </w:rPr>
-        <w:t xml:space="preserve"> == '2':</w:t>
+        <w:t xml:space="preserve"> choice == '2':</w:t>
       </w:r>
     </w:p>
     <w:p>
@@ -16206,29 +16024,7 @@
           <w:szCs w:val="18"/>
           <w:lang w:val="uk-UA"/>
         </w:rPr>
-        <w:t xml:space="preserve"> </w:t>
-      </w:r>
-      <w:proofErr w:type="spellStart"/>
-      <w:r>
-        <w:rPr>
-          <w:rFonts w:ascii="Consolas" w:hAnsi="Consolas"/>
-          <w:bCs/>
-          <w:sz w:val="18"/>
-          <w:szCs w:val="18"/>
-          <w:lang w:val="uk-UA"/>
-        </w:rPr>
-        <w:t>choice</w:t>
-      </w:r>
-      <w:proofErr w:type="spellEnd"/>
-      <w:r>
-        <w:rPr>
-          <w:rFonts w:ascii="Consolas" w:hAnsi="Consolas"/>
-          <w:bCs/>
-          <w:sz w:val="18"/>
-          <w:szCs w:val="18"/>
-          <w:lang w:val="uk-UA"/>
-        </w:rPr>
-        <w:t xml:space="preserve"> == '3':</w:t>
+        <w:t xml:space="preserve"> choice == '3':</w:t>
       </w:r>
     </w:p>
     <w:p>
@@ -16490,6 +16286,7 @@
       <w:r>
         <w:rPr>
           <w:bCs/>
+          <w:noProof/>
           <w:sz w:val="28"/>
           <w:szCs w:val="28"/>
           <w:lang w:val="en-US"/>
@@ -16641,6 +16438,7 @@
       <w:r>
         <w:rPr>
           <w:bCs/>
+          <w:noProof/>
           <w:sz w:val="28"/>
           <w:szCs w:val="28"/>
           <w:lang w:val="uk-UA"/>
@@ -16700,25 +16498,7 @@
           <w:szCs w:val="28"/>
           <w:lang w:val="uk-UA"/>
         </w:rPr>
-        <w:t xml:space="preserve">Рис. </w:t>
-      </w:r>
-      <w:r>
-        <w:rPr>
-          <w:bCs/>
-          <w:sz w:val="28"/>
-          <w:szCs w:val="28"/>
-          <w:lang w:val="uk-UA"/>
-        </w:rPr>
-        <w:t>8</w:t>
-      </w:r>
-      <w:r>
-        <w:rPr>
-          <w:bCs/>
-          <w:sz w:val="28"/>
-          <w:szCs w:val="28"/>
-          <w:lang w:val="uk-UA"/>
-        </w:rPr>
-        <w:t>. –</w:t>
+        <w:t>Рис. 8. –</w:t>
       </w:r>
       <w:r>
         <w:rPr>
@@ -16736,34 +16516,7 @@
           <w:szCs w:val="28"/>
           <w:lang w:val="uk-UA"/>
         </w:rPr>
-        <w:t>Порівняння</w:t>
-      </w:r>
-      <w:r>
-        <w:rPr>
-          <w:bCs/>
-          <w:sz w:val="28"/>
-          <w:szCs w:val="28"/>
-          <w:lang w:val="uk-UA"/>
-        </w:rPr>
-        <w:t xml:space="preserve"> зображен</w:t>
-      </w:r>
-      <w:r>
-        <w:rPr>
-          <w:bCs/>
-          <w:sz w:val="28"/>
-          <w:szCs w:val="28"/>
-          <w:lang w:val="uk-UA"/>
-        </w:rPr>
-        <w:t>ь</w:t>
-      </w:r>
-      <w:r>
-        <w:rPr>
-          <w:bCs/>
-          <w:sz w:val="28"/>
-          <w:szCs w:val="28"/>
-          <w:lang w:val="uk-UA"/>
-        </w:rPr>
-        <w:t xml:space="preserve"> Зліва оригінальне, а справа з прихованими даними</w:t>
+        <w:t>Порівняння зображень Зліва оригінальне, а справа з прихованими даними</w:t>
       </w:r>
     </w:p>
     <w:p>
@@ -17507,16 +17260,7 @@
           <w:szCs w:val="28"/>
           <w:lang w:val="uk-UA"/>
         </w:rPr>
-        <w:t xml:space="preserve"> </w:t>
-      </w:r>
-      <w:r>
-        <w:rPr>
-          <w:bCs/>
-          <w:sz w:val="28"/>
-          <w:szCs w:val="28"/>
-          <w:lang w:val="uk-UA"/>
-        </w:rPr>
-        <w:t>–</w:t>
+        <w:t xml:space="preserve"> –</w:t>
       </w:r>
       <w:r>
         <w:rPr>
@@ -19379,6 +19123,31 @@
         </w:rPr>
         <w:t>:</w:t>
       </w:r>
+      <w:r>
+        <w:rPr>
+          <w:bCs/>
+          <w:i/>
+          <w:iCs/>
+          <w:sz w:val="28"/>
+          <w:szCs w:val="28"/>
+          <w:lang w:val="en-US"/>
+        </w:rPr>
+        <w:t xml:space="preserve"> </w:t>
+      </w:r>
+      <w:hyperlink r:id="rId22" w:history="1">
+        <w:r>
+          <w:rPr>
+            <w:rStyle w:val="a8"/>
+            <w:bCs/>
+            <w:i/>
+            <w:iCs/>
+            <w:sz w:val="28"/>
+            <w:szCs w:val="28"/>
+            <w:lang w:val="en-US"/>
+          </w:rPr>
+          <w:t>https://github.com/Student-Vlad-Bondar/Steganography-labs</w:t>
+        </w:r>
+      </w:hyperlink>
       <w:r>
         <w:rPr>
           <w:bCs/>
@@ -24957,8 +24726,8 @@
       </w:r>
     </w:p>
     <w:sectPr>
-      <w:headerReference w:type="default" r:id="rId22"/>
-      <w:headerReference w:type="first" r:id="rId23"/>
+      <w:headerReference w:type="default" r:id="rId23"/>
+      <w:headerReference w:type="first" r:id="rId24"/>
       <w:type w:val="continuous"/>
       <w:pgSz w:w="11906" w:h="16838"/>
       <w:pgMar w:top="567" w:right="567" w:bottom="1701" w:left="1418" w:header="709" w:footer="709" w:gutter="0"/>
@@ -28556,13 +28325,7 @@
                                 <w:rPr>
                                   <w:sz w:val="20"/>
                                 </w:rPr>
-                                <w:t xml:space="preserve"> </w:t>
-                              </w:r>
-                              <w:r>
-                                <w:rPr>
-                                  <w:sz w:val="20"/>
-                                </w:rPr>
-                                <w:t>Керівник</w:t>
+                                <w:t xml:space="preserve"> Керівник</w:t>
                               </w:r>
                             </w:p>
                           </w:txbxContent>
@@ -28681,13 +28444,7 @@
                                 <w:rPr>
                                   <w:sz w:val="20"/>
                                 </w:rPr>
-                                <w:t xml:space="preserve"> </w:t>
-                              </w:r>
-                              <w:r>
-                                <w:rPr>
-                                  <w:sz w:val="20"/>
-                                </w:rPr>
-                                <w:t>Н. контр.</w:t>
+                                <w:t xml:space="preserve"> Н. контр.</w:t>
                               </w:r>
                             </w:p>
                           </w:txbxContent>
@@ -28806,13 +28563,7 @@
                                 <w:rPr>
                                   <w:sz w:val="20"/>
                                 </w:rPr>
-                                <w:t xml:space="preserve"> </w:t>
-                              </w:r>
-                              <w:r>
-                                <w:rPr>
-                                  <w:sz w:val="20"/>
-                                </w:rPr>
-                                <w:t>Зав. каф.</w:t>
+                                <w:t xml:space="preserve"> Зав. каф.</w:t>
                               </w:r>
                             </w:p>
                           </w:txbxContent>
@@ -31767,6 +31518,7 @@
   <w:style w:type="character" w:default="1" w:styleId="a0">
     <w:name w:val="Default Paragraph Font"/>
     <w:uiPriority w:val="1"/>
+    <w:semiHidden/>
     <w:unhideWhenUsed/>
   </w:style>
   <w:style w:type="table" w:default="1" w:styleId="a1">
@@ -32653,6 +32405,18 @@
       <w:rFonts w:ascii="Courier New" w:eastAsia="Times New Roman" w:hAnsi="Courier New" w:cs="Courier New"/>
     </w:rPr>
   </w:style>
+  <w:style w:type="character" w:styleId="af6">
+    <w:name w:val="Unresolved Mention"/>
+    <w:basedOn w:val="a0"/>
+    <w:uiPriority w:val="99"/>
+    <w:semiHidden/>
+    <w:unhideWhenUsed/>
+    <w:rsid w:val="00BF165F"/>
+    <w:rPr>
+      <w:color w:val="605E5C"/>
+      <w:shd w:val="clear" w:color="auto" w:fill="E1DFDD"/>
+    </w:rPr>
+  </w:style>
 </w:styles>
 </file>
 

</xml_diff>